<commit_message>
Deploy preview for PR 90 🛫
</commit_message>
<xml_diff>
--- a/pr-preview/pr-90/chapters/01-introduction-tracked-changes.docx
+++ b/pr-preview/pr-90/chapters/01-introduction-tracked-changes.docx
@@ -7412,7 +7412,13 @@
               <w:t xml:space="preserve"> </w:t>
             </w:r>
             <w:r>
-              <w:t xml:space="preserve">The NNT was introduced by Laupacis, Sackett, and Roberts (1988); like the risk difference, it applies only to the population and time interval on which it is based</w:t>
+              <w:t xml:space="preserve">The NNT was introduced by Laupacis, Sackett, and Roberts (1988);</w:t>
+            </w:r>
+            <w:r>
+              <w:t xml:space="preserve"> </w:t>
+            </w:r>
+            <w:r>
+              <w:t xml:space="preserve">like the risk difference, it applies only to the population and time interval on which it is based</w:t>
             </w:r>
             <w:r>
               <w:t xml:space="preserve"> </w:t>
@@ -11513,7 +11519,17 @@
       </w:pPr>
       <w:ins w:id="100" w:author="PR Preview" w:date="2024-01-01T00:00:00Z">
         <w:r>
-          <w:t xml:space="preserve">Association measures are also subject to random variability; until Chapter 10 the book ignores this by assuming the population of Table 1.2 is extremely large</w:t>
+          <w:t xml:space="preserve">Association measures are also subject to random variability;</w:t>
+        </w:r>
+      </w:ins>
+      <w:ins w:id="100" w:author="PR Preview" w:date="2024-01-01T00:00:00Z">
+        <w:r>
+          <w:t xml:space="preserve"> </w:t>
+        </w:r>
+      </w:ins>
+      <w:ins w:id="100" w:author="PR Preview" w:date="2024-01-01T00:00:00Z">
+        <w:r>
+          <w:t xml:space="preserve">until Chapter 10 the book ignores this by assuming the population of Table 1.2 is extremely large</w:t>
         </w:r>
       </w:ins>
       <w:ins w:id="100" w:author="PR Preview" w:date="2024-01-01T00:00:00Z">

</xml_diff>